<commit_message>
Email manual: Gmail needs an app password; SSL port is 465, not 445
Co-Authored-By: Claude Opus 5.5 <noreply@anthropic.com>
</commit_message>
<xml_diff>
--- a/Email.docx
+++ b/Email.docx
@@ -1,6 +1,6 @@
 
 <file path=word/document.xml><?xml version="1.0" encoding="utf-8"?>
-<w:document xmlns:wpc="http://schemas.microsoft.com/office/word/2010/wordprocessingCanvas" xmlns:cx="http://schemas.microsoft.com/office/drawing/2014/chartex" xmlns:cx1="http://schemas.microsoft.com/office/drawing/2015/9/8/chartex" xmlns:cx2="http://schemas.microsoft.com/office/drawing/2015/10/21/chartex" xmlns:cx3="http://schemas.microsoft.com/office/drawing/2016/5/9/chartex" xmlns:cx4="http://schemas.microsoft.com/office/drawing/2016/5/10/chartex" xmlns:cx5="http://schemas.microsoft.com/office/drawing/2016/5/11/chartex" xmlns:cx6="http://schemas.microsoft.com/office/drawing/2016/5/12/chartex" xmlns:cx7="http://schemas.microsoft.com/office/drawing/2016/5/13/chartex" xmlns:cx8="http://schemas.microsoft.com/office/drawing/2016/5/14/chartex" xmlns:mc="http://schemas.openxmlformats.org/markup-compatibility/2006" xmlns:aink="http://schemas.microsoft.com/office/drawing/2016/ink" xmlns:am3d="http://schemas.microsoft.com/office/drawing/2017/model3d" xmlns:o="urn:schemas-microsoft-com:office:office" xmlns:oel="http://schemas.microsoft.com/office/2019/extlst" xmlns:r="http://schemas.openxmlformats.org/officeDocument/2006/relationships" xmlns:m="http://schemas.openxmlformats.org/officeDocument/2006/math" xmlns:v="urn:schemas-microsoft-com:vml" xmlns:wp14="http://schemas.microsoft.com/office/word/2010/wordprocessingDrawing" xmlns:wp="http://schemas.openxmlformats.org/drawingml/2006/wordprocessingDrawing" xmlns:w10="urn:schemas-microsoft-com:office:word" xmlns:w="http://schemas.openxmlformats.org/wordprocessingml/2006/main" xmlns:w14="http://schemas.microsoft.com/office/word/2010/wordml" xmlns:w15="http://schemas.microsoft.com/office/word/2012/wordml" xmlns:w16cex="http://schemas.microsoft.com/office/word/2018/wordml/cex" xmlns:w16cid="http://schemas.microsoft.com/office/word/2016/wordml/cid" xmlns:w16="http://schemas.microsoft.com/office/word/2018/wordml" xmlns:w16du="http://schemas.microsoft.com/office/word/2023/wordml/word16du" xmlns:w16sdtdh="http://schemas.microsoft.com/office/word/2020/wordml/sdtdatahash" xmlns:w16se="http://schemas.microsoft.com/office/word/2015/wordml/symex" xmlns:wpg="http://schemas.microsoft.com/office/word/2010/wordprocessingGroup" xmlns:wpi="http://schemas.microsoft.com/office/word/2010/wordprocessingInk" xmlns:wne="http://schemas.microsoft.com/office/word/2006/wordml" xmlns:wps="http://schemas.microsoft.com/office/word/2010/wordprocessingShape" mc:Ignorable="w14 w15 w16se w16cid w16 w16cex w16sdtdh w16du wp14">
+<w:document xmlns:wpc="http://schemas.microsoft.com/office/word/2010/wordprocessingCanvas" xmlns:cx="http://schemas.microsoft.com/office/drawing/2014/chartex" xmlns:cx1="http://schemas.microsoft.com/office/drawing/2015/9/8/chartex" xmlns:cx2="http://schemas.microsoft.com/office/drawing/2015/10/21/chartex" xmlns:cx3="http://schemas.microsoft.com/office/drawing/2016/5/9/chartex" xmlns:cx4="http://schemas.microsoft.com/office/drawing/2016/5/10/chartex" xmlns:cx5="http://schemas.microsoft.com/office/drawing/2016/5/11/chartex" xmlns:cx6="http://schemas.microsoft.com/office/drawing/2016/5/12/chartex" xmlns:cx7="http://schemas.microsoft.com/office/drawing/2016/5/13/chartex" xmlns:cx8="http://schemas.microsoft.com/office/drawing/2016/5/14/chartex" xmlns:mc="http://schemas.openxmlformats.org/markup-compatibility/2006" xmlns:aink="http://schemas.microsoft.com/office/drawing/2016/ink" xmlns:am3d="http://schemas.microsoft.com/office/drawing/2017/model3d" xmlns:o="urn:schemas-microsoft-com:office:office" xmlns:oel="http://schemas.microsoft.com/office/2019/extlst" xmlns:r="http://schemas.openxmlformats.org/officeDocument/2006/relationships" xmlns:m="http://schemas.openxmlformats.org/officeDocument/2006/math" xmlns:v="urn:schemas-microsoft-com:vml" xmlns:wp14="http://schemas.microsoft.com/office/word/2010/wordprocessingDrawing" xmlns:wp="http://schemas.openxmlformats.org/drawingml/2006/wordprocessingDrawing" xmlns:w10="urn:schemas-microsoft-com:office:word" xmlns:w="http://schemas.openxmlformats.org/wordprocessingml/2006/main" xmlns:w14="http://schemas.microsoft.com/office/word/2010/wordml" xmlns:w15="http://schemas.microsoft.com/office/word/2012/wordml" xmlns:w16cex="http://schemas.microsoft.com/office/word/2018/wordml/cex" xmlns:w16cid="http://schemas.microsoft.com/office/word/2016/wordml/cid" xmlns:w16="http://schemas.microsoft.com/office/word/2018/wordml" xmlns:w16du="http://schemas.microsoft.com/office/word/2023/wordml/word16du" xmlns:w16sdtdh="http://schemas.microsoft.com/office/word/2020/wordml/sdtdatahash" xmlns:w16sdtfl="http://schemas.microsoft.com/office/word/2024/wordml/sdtformatlock" xmlns:w16se="http://schemas.microsoft.com/office/word/2015/wordml/symex" xmlns:wpg="http://schemas.microsoft.com/office/word/2010/wordprocessingGroup" xmlns:wpi="http://schemas.microsoft.com/office/word/2010/wordprocessingInk" xmlns:wne="http://schemas.microsoft.com/office/word/2006/wordml" xmlns:wps="http://schemas.microsoft.com/office/word/2010/wordprocessingShape" mc:Ignorable="w14 w15 w16se w16cid w16 w16cex w16sdtdh w16sdtfl w16du wp14">
   <w:body>
     <w:p>
       <w:pPr>
@@ -151,7 +151,21 @@
         <w:rPr>
           <w:rFonts w:eastAsia="Times New Roman"/>
         </w:rPr>
-        <w:t xml:space="preserve"> server to send the emails.  These can be commercial places such as pobox.com, your own email server using Microsoft Server, or a free SMTP server.   </w:t>
+        <w:t xml:space="preserve"> server to send </w:t>
+      </w:r>
+      <w:proofErr w:type="gramStart"/>
+      <w:r>
+        <w:rPr>
+          <w:rFonts w:eastAsia="Times New Roman"/>
+        </w:rPr>
+        <w:t>the emails</w:t>
+      </w:r>
+      <w:proofErr w:type="gramEnd"/>
+      <w:r>
+        <w:rPr>
+          <w:rFonts w:eastAsia="Times New Roman"/>
+        </w:rPr>
+        <w:t xml:space="preserve">.  These can be commercial places such as pobox.com, your own email server using Microsoft Server, or a free SMTP server.   </w:t>
       </w:r>
       <w:r>
         <w:rPr>
@@ -280,75 +294,349 @@
         <w:rPr>
           <w:rFonts w:eastAsia="Times New Roman"/>
         </w:rPr>
-        <w:t xml:space="preserve">” and SMTP Password is the email name and password you normally use to log into your email server to send email. </w:t>
-      </w:r>
-    </w:p>
-    <w:p>
-      <w:pPr>
-        <w:rPr>
-          <w:rFonts w:eastAsia="Times New Roman"/>
-        </w:rPr>
-      </w:pPr>
-      <w:r>
-        <w:rPr>
-          <w:rFonts w:eastAsia="Times New Roman"/>
-        </w:rPr>
-        <w:lastRenderedPageBreak/>
-        <w:t xml:space="preserve">The port should be what your server documentation says.  This is typically 25 for </w:t>
+        <w:t xml:space="preserve">” and SMTP Password is the email name and password you normally use to log into your email server to send email. Gmail is different: it needs a special “app password”. See GMAIL below. </w:t>
+      </w:r>
+    </w:p>
+    <w:p>
+      <w:pPr>
+        <w:rPr>
+          <w:rFonts w:eastAsia="Times New Roman"/>
+        </w:rPr>
+      </w:pPr>
+      <w:r>
+        <w:rPr>
+          <w:rFonts w:eastAsia="Times New Roman"/>
+        </w:rPr>
+        <w:t>The port should be what your server documentation says.  This is typically 25 for unsecure email, 465 for SSL/TLS Email (choose SslOnConnect), or 587 for TLS (choose StartTls).</w:t>
+      </w:r>
+    </w:p>
+    <w:p>
+      <w:pPr>
+        <w:rPr>
+          <w:rFonts w:eastAsia="Times New Roman"/>
+        </w:rPr>
+      </w:pPr>
+      <w:r>
+        <w:rPr>
+          <w:rFonts w:eastAsia="Times New Roman"/>
+        </w:rPr>
+        <w:t>In my case, I had to use the Automatic setting as none of the others worked</w:t>
+      </w:r>
+    </w:p>
+    <w:p>
+      <w:pPr>
+        <w:rPr>
+          <w:rFonts w:eastAsia="Times New Roman"/>
+        </w:rPr>
+      </w:pPr>
+      <w:r>
+        <w:rPr>
+          <w:rFonts w:eastAsia="Times New Roman"/>
+        </w:rPr>
+        <w:t>There are many options for Opensim prims.</w:t>
+      </w:r>
+    </w:p>
+    <w:p>
+      <w:pPr>
+        <w:rPr>
+          <w:rFonts w:eastAsia="Times New Roman"/>
+        </w:rPr>
+      </w:pPr>
+    </w:p>
+    <w:p>
+      <w:pPr>
+        <w:pStyle w:val="Heading2"/>
+        <w:rPr>
+          <w:rFonts w:eastAsia="Times New Roman"/>
+        </w:rPr>
+      </w:pPr>
+      <w:r>
+        <w:rPr>
+          <w:rFonts w:eastAsia="Times New Roman"/>
+        </w:rPr>
+        <w:t>GMAIL</w:t>
+      </w:r>
+    </w:p>
+    <w:p>
+      <w:pPr>
+        <w:rPr>
+          <w:rFonts w:eastAsia="Times New Roman"/>
+        </w:rPr>
+      </w:pPr>
+      <w:r>
+        <w:rPr>
+          <w:rFonts w:eastAsia="Times New Roman"/>
+        </w:rPr>
+        <w:t>1. Open https://myaccount.google.com/security and turn on 2-Step Verification.</w:t>
+      </w:r>
+    </w:p>
+    <w:p>
+      <w:pPr>
+        <w:rPr>
+          <w:rFonts w:eastAsia="Times New Roman"/>
+        </w:rPr>
+      </w:pPr>
+      <w:r>
+        <w:rPr>
+          <w:rFonts w:eastAsia="Times New Roman"/>
+        </w:rPr>
+        <w:t>2. Open https://myaccount.google.com/apppasswords, type the name "DreamGrid", press Create.</w:t>
+      </w:r>
+    </w:p>
+    <w:p>
+      <w:pPr>
+        <w:rPr>
+          <w:rFonts w:eastAsia="Times New Roman"/>
+        </w:rPr>
+      </w:pPr>
+      <w:r>
+        <w:rPr>
+          <w:rFonts w:eastAsia="Times New Roman"/>
+        </w:rPr>
+        <w:t>3. Copy the 16 letters. Google shows them only once.</w:t>
+      </w:r>
+    </w:p>
+    <w:p>
+      <w:pPr>
+        <w:rPr>
+          <w:rFonts w:eastAsia="Times New Roman"/>
+        </w:rPr>
+      </w:pPr>
+      <w:r>
+        <w:rPr>
+          <w:rFonts w:eastAsia="Times New Roman"/>
+        </w:rPr>
+        <w:t xml:space="preserve">4. In </w:t>
+      </w:r>
+      <w:proofErr w:type="spellStart"/>
+      <w:r>
+        <w:rPr>
+          <w:rFonts w:eastAsia="Times New Roman"/>
+        </w:rPr>
+        <w:t>DreamGrid's</w:t>
+      </w:r>
+      <w:proofErr w:type="spellEnd"/>
+      <w:r>
+        <w:rPr>
+          <w:rFonts w:eastAsia="Times New Roman"/>
+        </w:rPr>
+        <w:t xml:space="preserve"> Email panel:</w:t>
+      </w:r>
+    </w:p>
+    <w:p>
+      <w:pPr>
+        <w:rPr>
+          <w:rFonts w:eastAsia="Times New Roman"/>
+        </w:rPr>
+      </w:pPr>
+      <w:r>
+        <w:rPr>
+          <w:rFonts w:eastAsia="Times New Roman"/>
+        </w:rPr>
+        <w:t xml:space="preserve">   - User Name: your full Gmail address</w:t>
+      </w:r>
+    </w:p>
+    <w:p>
+      <w:pPr>
+        <w:rPr>
+          <w:rFonts w:eastAsia="Times New Roman"/>
+        </w:rPr>
+      </w:pPr>
+      <w:r>
+        <w:rPr>
+          <w:rFonts w:eastAsia="Times New Roman"/>
+        </w:rPr>
+        <w:t xml:space="preserve">   - SMTP Password: </w:t>
       </w:r>
       <w:proofErr w:type="gramStart"/>
       <w:r>
         <w:rPr>
           <w:rFonts w:eastAsia="Times New Roman"/>
         </w:rPr>
-        <w:t>unsecure</w:t>
+        <w:t>the 16</w:t>
       </w:r>
       <w:proofErr w:type="gramEnd"/>
       <w:r>
         <w:rPr>
           <w:rFonts w:eastAsia="Times New Roman"/>
         </w:rPr>
-        <w:t xml:space="preserve"> </w:t>
+        <w:t xml:space="preserve"> letters (DreamGrid removes the spaces for you)</w:t>
+      </w:r>
+    </w:p>
+    <w:p>
+      <w:pPr>
+        <w:rPr>
+          <w:rFonts w:eastAsia="Times New Roman"/>
+        </w:rPr>
+      </w:pPr>
+      <w:r>
+        <w:rPr>
+          <w:rFonts w:eastAsia="Times New Roman"/>
+        </w:rPr>
+        <w:t xml:space="preserve">   - SMTP Host: smtp.gmail.com</w:t>
+      </w:r>
+    </w:p>
+    <w:p>
+      <w:pPr>
+        <w:rPr>
+          <w:rFonts w:eastAsia="Times New Roman"/>
+        </w:rPr>
+      </w:pPr>
+      <w:r>
+        <w:rPr>
+          <w:rFonts w:eastAsia="Times New Roman"/>
+        </w:rPr>
+        <w:t xml:space="preserve">   - SMTP Port: 587</w:t>
+      </w:r>
+    </w:p>
+    <w:p>
+      <w:pPr>
+        <w:rPr>
+          <w:rFonts w:eastAsia="Times New Roman"/>
+        </w:rPr>
+      </w:pPr>
+      <w:r>
+        <w:rPr>
+          <w:rFonts w:eastAsia="Times New Roman"/>
+        </w:rPr>
+        <w:t xml:space="preserve">   - Security: </w:t>
+      </w:r>
+      <w:proofErr w:type="spellStart"/>
+      <w:r>
+        <w:rPr>
+          <w:rFonts w:eastAsia="Times New Roman"/>
+        </w:rPr>
+        <w:t>StartTls</w:t>
+      </w:r>
+      <w:proofErr w:type="spellEnd"/>
+    </w:p>
+    <w:p>
+      <w:pPr>
+        <w:rPr>
+          <w:rFonts w:eastAsia="Times New Roman"/>
+        </w:rPr>
+      </w:pPr>
+      <w:r>
+        <w:rPr>
+          <w:rFonts w:eastAsia="Times New Roman"/>
+        </w:rPr>
+        <w:t>5. Press Test. Restart the regions so that scripts (</w:t>
+      </w:r>
+      <w:proofErr w:type="spellStart"/>
+      <w:r>
+        <w:rPr>
+          <w:rFonts w:eastAsia="Times New Roman"/>
+        </w:rPr>
+        <w:t>llEmail</w:t>
+      </w:r>
+      <w:proofErr w:type="spellEnd"/>
+      <w:r>
+        <w:rPr>
+          <w:rFonts w:eastAsia="Times New Roman"/>
+        </w:rPr>
+        <w:t>) use the new settings.</w:t>
+      </w:r>
+    </w:p>
+    <w:p>
+      <w:pPr>
+        <w:rPr>
+          <w:rFonts w:eastAsia="Times New Roman"/>
+          <w:b/>
+          <w:bCs/>
+          <w:i/>
+          <w:iCs/>
+        </w:rPr>
+      </w:pPr>
+      <w:r>
+        <w:rPr>
+          <w:rFonts w:eastAsia="Times New Roman"/>
+          <w:b/>
+          <w:bCs/>
+          <w:i/>
+          <w:iCs/>
+        </w:rPr>
+        <w:t>Good to know:</w:t>
+      </w:r>
+    </w:p>
+    <w:p>
+      <w:pPr>
+        <w:rPr>
+          <w:rFonts w:eastAsia="Times New Roman"/>
+        </w:rPr>
+      </w:pPr>
+      <w:r>
+        <w:rPr>
+          <w:rFonts w:eastAsia="Times New Roman"/>
+        </w:rPr>
+        <w:t>- If you change your Google password, Google deletes the app password.</w:t>
+      </w:r>
+    </w:p>
+    <w:p>
+      <w:pPr>
+        <w:rPr>
+          <w:rFonts w:eastAsia="Times New Roman"/>
+        </w:rPr>
+      </w:pPr>
+      <w:r>
+        <w:rPr>
+          <w:rFonts w:eastAsia="Times New Roman"/>
+        </w:rPr>
+        <w:t xml:space="preserve">- "App passwords" </w:t>
       </w:r>
       <w:proofErr w:type="gramStart"/>
       <w:r>
         <w:rPr>
           <w:rFonts w:eastAsia="Times New Roman"/>
         </w:rPr>
-        <w:t>email,  445</w:t>
+        <w:t>is</w:t>
       </w:r>
       <w:proofErr w:type="gramEnd"/>
       <w:r>
         <w:rPr>
           <w:rFonts w:eastAsia="Times New Roman"/>
         </w:rPr>
-        <w:t xml:space="preserve"> for SSL/TLS  Email, or 587 for TLS.</w:t>
-      </w:r>
-    </w:p>
-    <w:p>
-      <w:pPr>
-        <w:rPr>
-          <w:rFonts w:eastAsia="Times New Roman"/>
-        </w:rPr>
-      </w:pPr>
-      <w:r>
-        <w:rPr>
-          <w:rFonts w:eastAsia="Times New Roman"/>
-        </w:rPr>
-        <w:t>In my case, I had to use the Automatic setting as none of the others worked</w:t>
-      </w:r>
-    </w:p>
-    <w:p>
-      <w:pPr>
-        <w:rPr>
-          <w:rFonts w:eastAsia="Times New Roman"/>
-        </w:rPr>
-      </w:pPr>
-      <w:r>
-        <w:rPr>
-          <w:rFonts w:eastAsia="Times New Roman"/>
-        </w:rPr>
-        <w:t>There are many options for Opensim prims.</w:t>
+        <w:t xml:space="preserve"> missing </w:t>
+      </w:r>
+      <w:proofErr w:type="gramStart"/>
+      <w:r>
+        <w:rPr>
+          <w:rFonts w:eastAsia="Times New Roman"/>
+        </w:rPr>
+        <w:t>on</w:t>
+      </w:r>
+      <w:proofErr w:type="gramEnd"/>
+      <w:r>
+        <w:rPr>
+          <w:rFonts w:eastAsia="Times New Roman"/>
+        </w:rPr>
+        <w:t xml:space="preserve"> work or school accounts.</w:t>
+      </w:r>
+    </w:p>
+    <w:p>
+      <w:pPr>
+        <w:rPr>
+          <w:rFonts w:eastAsia="Times New Roman"/>
+        </w:rPr>
+      </w:pPr>
+      <w:r>
+        <w:rPr>
+          <w:rFonts w:eastAsia="Times New Roman"/>
+        </w:rPr>
+        <w:t xml:space="preserve">- Gmail </w:t>
+      </w:r>
+      <w:proofErr w:type="gramStart"/>
+      <w:r>
+        <w:rPr>
+          <w:rFonts w:eastAsia="Times New Roman"/>
+        </w:rPr>
+        <w:t>allows</w:t>
+      </w:r>
+      <w:proofErr w:type="gramEnd"/>
+      <w:r>
+        <w:rPr>
+          <w:rFonts w:eastAsia="Times New Roman"/>
+        </w:rPr>
+        <w:t xml:space="preserve"> about 500 emails a day.</w:t>
       </w:r>
     </w:p>
     <w:p>
@@ -375,21 +663,7 @@
         <w:rPr>
           <w:rFonts w:eastAsia="Times New Roman"/>
         </w:rPr>
-        <w:t xml:space="preserve">Mail protocols (SMTP, IMAP, and POP3) all have </w:t>
-      </w:r>
-      <w:proofErr w:type="gramStart"/>
-      <w:r>
-        <w:rPr>
-          <w:rFonts w:eastAsia="Times New Roman"/>
-        </w:rPr>
-        <w:t>2</w:t>
-      </w:r>
-      <w:proofErr w:type="gramEnd"/>
-      <w:r>
-        <w:rPr>
-          <w:rFonts w:eastAsia="Times New Roman"/>
-        </w:rPr>
-        <w:t xml:space="preserve"> different ways of doing SSL.</w:t>
+        <w:t>Mail protocols (SMTP, IMAP, and POP3) all have 2 different ways of doing SSL.</w:t>
       </w:r>
     </w:p>
     <w:p>
@@ -492,33 +766,19 @@
         <w:rPr>
           <w:rFonts w:ascii="inherit" w:eastAsia="Times New Roman" w:hAnsi="inherit"/>
         </w:rPr>
-        <w:t xml:space="preserve">: </w:t>
-      </w:r>
-      <w:proofErr w:type="gramStart"/>
+        <w:t>: Do</w:t>
+      </w:r>
       <w:r>
         <w:rPr>
           <w:rFonts w:ascii="inherit" w:eastAsia="Times New Roman" w:hAnsi="inherit"/>
         </w:rPr>
-        <w:t>Do</w:t>
+        <w:t>es</w:t>
       </w:r>
       <w:r>
         <w:rPr>
           <w:rFonts w:ascii="inherit" w:eastAsia="Times New Roman" w:hAnsi="inherit"/>
         </w:rPr>
-        <w:t>es</w:t>
-      </w:r>
-      <w:r>
-        <w:rPr>
-          <w:rFonts w:ascii="inherit" w:eastAsia="Times New Roman" w:hAnsi="inherit"/>
-        </w:rPr>
-        <w:t>n't</w:t>
-      </w:r>
-      <w:proofErr w:type="gramEnd"/>
-      <w:r>
-        <w:rPr>
-          <w:rFonts w:ascii="inherit" w:eastAsia="Times New Roman" w:hAnsi="inherit"/>
-        </w:rPr>
-        <w:t xml:space="preserve"> use any form of SSL (or TLS).</w:t>
+        <w:t>n't use any form of SSL (or TLS).</w:t>
       </w:r>
     </w:p>
     <w:p>
@@ -636,21 +896,7 @@
         <w:rPr>
           <w:rFonts w:ascii="inherit" w:eastAsia="Times New Roman" w:hAnsi="inherit"/>
         </w:rPr>
-        <w:t xml:space="preserve"> method for SSL/TLS encryption. If the server </w:t>
-      </w:r>
-      <w:proofErr w:type="gramStart"/>
-      <w:r>
-        <w:rPr>
-          <w:rFonts w:ascii="inherit" w:eastAsia="Times New Roman" w:hAnsi="inherit"/>
-        </w:rPr>
-        <w:t>doesn't</w:t>
-      </w:r>
-      <w:proofErr w:type="gramEnd"/>
-      <w:r>
-        <w:rPr>
-          <w:rFonts w:ascii="inherit" w:eastAsia="Times New Roman" w:hAnsi="inherit"/>
-        </w:rPr>
-        <w:t xml:space="preserve"> support the </w:t>
+        <w:t> method for SSL/TLS encryption. If the server doesn't support the </w:t>
       </w:r>
       <w:r>
         <w:rPr>
@@ -872,21 +1118,7 @@
         <w:rPr>
           <w:rFonts w:eastAsia="Times New Roman"/>
         </w:rPr>
-        <w:t xml:space="preserve"> is the preferred method for encrypting </w:t>
-      </w:r>
-      <w:proofErr w:type="gramStart"/>
-      <w:r>
-        <w:rPr>
-          <w:rFonts w:eastAsia="Times New Roman"/>
-        </w:rPr>
-        <w:t>communications</w:t>
-      </w:r>
-      <w:proofErr w:type="gramEnd"/>
-      <w:r>
-        <w:rPr>
-          <w:rFonts w:eastAsia="Times New Roman"/>
-        </w:rPr>
-        <w:t xml:space="preserve"> between a client and a mail server, but SSL-wrapped ports are still in wide use as well.</w:t>
+        <w:t> is the preferred method for encrypting communications between a client and a mail server, but SSL-wrapped ports are still in wide use as well.</w:t>
       </w:r>
     </w:p>
     <w:p>
@@ -920,7 +1152,6 @@
         </w:rPr>
         <w:t> the same as it treats </w:t>
       </w:r>
-      <w:proofErr w:type="gramStart"/>
       <w:r>
         <w:rPr>
           <w:rFonts w:ascii="var(--ff-mono)" w:eastAsia="Times New Roman" w:hAnsi="var(--ff-mono)" w:cs="Courier New"/>
@@ -928,7 +1159,6 @@
         </w:rPr>
         <w:t>25</w:t>
       </w:r>
-      <w:proofErr w:type="gramEnd"/>
       <w:r>
         <w:rPr>
           <w:rFonts w:eastAsia="Times New Roman"/>
@@ -987,7 +1217,7 @@
 </file>
 
 <file path=word/numbering.xml><?xml version="1.0" encoding="utf-8"?>
-<w:numbering xmlns:wpc="http://schemas.microsoft.com/office/word/2010/wordprocessingCanvas" xmlns:cx="http://schemas.microsoft.com/office/drawing/2014/chartex" xmlns:cx1="http://schemas.microsoft.com/office/drawing/2015/9/8/chartex" xmlns:cx2="http://schemas.microsoft.com/office/drawing/2015/10/21/chartex" xmlns:cx3="http://schemas.microsoft.com/office/drawing/2016/5/9/chartex" xmlns:cx4="http://schemas.microsoft.com/office/drawing/2016/5/10/chartex" xmlns:cx5="http://schemas.microsoft.com/office/drawing/2016/5/11/chartex" xmlns:cx6="http://schemas.microsoft.com/office/drawing/2016/5/12/chartex" xmlns:cx7="http://schemas.microsoft.com/office/drawing/2016/5/13/chartex" xmlns:cx8="http://schemas.microsoft.com/office/drawing/2016/5/14/chartex" xmlns:mc="http://schemas.openxmlformats.org/markup-compatibility/2006" xmlns:aink="http://schemas.microsoft.com/office/drawing/2016/ink" xmlns:am3d="http://schemas.microsoft.com/office/drawing/2017/model3d" xmlns:o="urn:schemas-microsoft-com:office:office" xmlns:oel="http://schemas.microsoft.com/office/2019/extlst" xmlns:r="http://schemas.openxmlformats.org/officeDocument/2006/relationships" xmlns:m="http://schemas.openxmlformats.org/officeDocument/2006/math" xmlns:v="urn:schemas-microsoft-com:vml" xmlns:wp14="http://schemas.microsoft.com/office/word/2010/wordprocessingDrawing" xmlns:wp="http://schemas.openxmlformats.org/drawingml/2006/wordprocessingDrawing" xmlns:w10="urn:schemas-microsoft-com:office:word" xmlns:w="http://schemas.openxmlformats.org/wordprocessingml/2006/main" xmlns:w14="http://schemas.microsoft.com/office/word/2010/wordml" xmlns:w15="http://schemas.microsoft.com/office/word/2012/wordml" xmlns:w16cex="http://schemas.microsoft.com/office/word/2018/wordml/cex" xmlns:w16cid="http://schemas.microsoft.com/office/word/2016/wordml/cid" xmlns:w16="http://schemas.microsoft.com/office/word/2018/wordml" xmlns:w16du="http://schemas.microsoft.com/office/word/2023/wordml/word16du" xmlns:w16sdtdh="http://schemas.microsoft.com/office/word/2020/wordml/sdtdatahash" xmlns:w16se="http://schemas.microsoft.com/office/word/2015/wordml/symex" xmlns:wpg="http://schemas.microsoft.com/office/word/2010/wordprocessingGroup" xmlns:wpi="http://schemas.microsoft.com/office/word/2010/wordprocessingInk" xmlns:wne="http://schemas.microsoft.com/office/word/2006/wordml" xmlns:wps="http://schemas.microsoft.com/office/word/2010/wordprocessingShape" mc:Ignorable="w14 w15 w16se w16cid w16 w16cex w16sdtdh w16du wp14">
+<w:numbering xmlns:wpc="http://schemas.microsoft.com/office/word/2010/wordprocessingCanvas" xmlns:cx="http://schemas.microsoft.com/office/drawing/2014/chartex" xmlns:cx1="http://schemas.microsoft.com/office/drawing/2015/9/8/chartex" xmlns:cx2="http://schemas.microsoft.com/office/drawing/2015/10/21/chartex" xmlns:cx3="http://schemas.microsoft.com/office/drawing/2016/5/9/chartex" xmlns:cx4="http://schemas.microsoft.com/office/drawing/2016/5/10/chartex" xmlns:cx5="http://schemas.microsoft.com/office/drawing/2016/5/11/chartex" xmlns:cx6="http://schemas.microsoft.com/office/drawing/2016/5/12/chartex" xmlns:cx7="http://schemas.microsoft.com/office/drawing/2016/5/13/chartex" xmlns:cx8="http://schemas.microsoft.com/office/drawing/2016/5/14/chartex" xmlns:mc="http://schemas.openxmlformats.org/markup-compatibility/2006" xmlns:aink="http://schemas.microsoft.com/office/drawing/2016/ink" xmlns:am3d="http://schemas.microsoft.com/office/drawing/2017/model3d" xmlns:o="urn:schemas-microsoft-com:office:office" xmlns:oel="http://schemas.microsoft.com/office/2019/extlst" xmlns:r="http://schemas.openxmlformats.org/officeDocument/2006/relationships" xmlns:m="http://schemas.openxmlformats.org/officeDocument/2006/math" xmlns:v="urn:schemas-microsoft-com:vml" xmlns:wp14="http://schemas.microsoft.com/office/word/2010/wordprocessingDrawing" xmlns:wp="http://schemas.openxmlformats.org/drawingml/2006/wordprocessingDrawing" xmlns:w10="urn:schemas-microsoft-com:office:word" xmlns:w="http://schemas.openxmlformats.org/wordprocessingml/2006/main" xmlns:w14="http://schemas.microsoft.com/office/word/2010/wordml" xmlns:w15="http://schemas.microsoft.com/office/word/2012/wordml" xmlns:w16cex="http://schemas.microsoft.com/office/word/2018/wordml/cex" xmlns:w16cid="http://schemas.microsoft.com/office/word/2016/wordml/cid" xmlns:w16="http://schemas.microsoft.com/office/word/2018/wordml" xmlns:w16du="http://schemas.microsoft.com/office/word/2023/wordml/word16du" xmlns:w16sdtdh="http://schemas.microsoft.com/office/word/2020/wordml/sdtdatahash" xmlns:w16sdtfl="http://schemas.microsoft.com/office/word/2024/wordml/sdtformatlock" xmlns:w16se="http://schemas.microsoft.com/office/word/2015/wordml/symex" xmlns:wpg="http://schemas.microsoft.com/office/word/2010/wordprocessingGroup" xmlns:wpi="http://schemas.microsoft.com/office/word/2010/wordprocessingInk" xmlns:wne="http://schemas.microsoft.com/office/word/2006/wordml" xmlns:wps="http://schemas.microsoft.com/office/word/2010/wordprocessingShape" mc:Ignorable="w14 w15 w16se w16cid w16 w16cex w16sdtdh w16sdtfl w16du wp14">
   <w:abstractNum w:abstractNumId="0" w15:restartNumberingAfterBreak="0">
     <w:nsid w:val="04706DDE"/>
     <w:multiLevelType w:val="hybridMultilevel"/>
@@ -1344,7 +1574,7 @@
 </file>
 
 <file path=word/styles.xml><?xml version="1.0" encoding="utf-8"?>
-<w:styles xmlns:mc="http://schemas.openxmlformats.org/markup-compatibility/2006" xmlns:r="http://schemas.openxmlformats.org/officeDocument/2006/relationships" xmlns:w="http://schemas.openxmlformats.org/wordprocessingml/2006/main" xmlns:w14="http://schemas.microsoft.com/office/word/2010/wordml" xmlns:w15="http://schemas.microsoft.com/office/word/2012/wordml" xmlns:w16cex="http://schemas.microsoft.com/office/word/2018/wordml/cex" xmlns:w16cid="http://schemas.microsoft.com/office/word/2016/wordml/cid" xmlns:w16="http://schemas.microsoft.com/office/word/2018/wordml" xmlns:w16du="http://schemas.microsoft.com/office/word/2023/wordml/word16du" xmlns:w16sdtdh="http://schemas.microsoft.com/office/word/2020/wordml/sdtdatahash" xmlns:w16se="http://schemas.microsoft.com/office/word/2015/wordml/symex" mc:Ignorable="w14 w15 w16se w16cid w16 w16cex w16sdtdh w16du">
+<w:styles xmlns:mc="http://schemas.openxmlformats.org/markup-compatibility/2006" xmlns:r="http://schemas.openxmlformats.org/officeDocument/2006/relationships" xmlns:w="http://schemas.openxmlformats.org/wordprocessingml/2006/main" xmlns:w14="http://schemas.microsoft.com/office/word/2010/wordml" xmlns:w15="http://schemas.microsoft.com/office/word/2012/wordml" xmlns:w16cex="http://schemas.microsoft.com/office/word/2018/wordml/cex" xmlns:w16cid="http://schemas.microsoft.com/office/word/2016/wordml/cid" xmlns:w16="http://schemas.microsoft.com/office/word/2018/wordml" xmlns:w16du="http://schemas.microsoft.com/office/word/2023/wordml/word16du" xmlns:w16sdtdh="http://schemas.microsoft.com/office/word/2020/wordml/sdtdatahash" xmlns:w16sdtfl="http://schemas.microsoft.com/office/word/2024/wordml/sdtformatlock" xmlns:w16se="http://schemas.microsoft.com/office/word/2015/wordml/symex" mc:Ignorable="w14 w15 w16se w16cid w16 w16cex w16sdtdh w16sdtfl w16du">
   <w:docDefaults>
     <w:rPrDefault>
       <w:rPr>

</xml_diff>

<commit_message>
drop old stiff, update flotsam and email
</commit_message>
<xml_diff>
--- a/Email.docx
+++ b/Email.docx
@@ -56,7 +56,13 @@
         <w:rPr>
           <w:rFonts w:eastAsia="Times New Roman"/>
         </w:rPr>
-        <w:t xml:space="preserve">You can send email to yourself when someone creates an account (See Help on Diva) or to the user when they reset their password.  </w:t>
+        <w:t>You can send email to yourself when someone creates an account (See Help on Diva) or to the user when they reset their password</w:t>
+      </w:r>
+      <w:r>
+        <w:rPr>
+          <w:rFonts w:eastAsia="Times New Roman"/>
+        </w:rPr>
+        <w:t xml:space="preserve">. </w:t>
       </w:r>
     </w:p>
     <w:p>
@@ -92,7 +98,13 @@
         <w:rPr>
           <w:rFonts w:eastAsia="Times New Roman"/>
         </w:rPr>
-        <w:t xml:space="preserve">to a prim using Opensim.   </w:t>
+        <w:t>to a prim using Opensim</w:t>
+      </w:r>
+      <w:r>
+        <w:rPr>
+          <w:rFonts w:eastAsia="Times New Roman"/>
+        </w:rPr>
+        <w:t xml:space="preserve">. </w:t>
       </w:r>
     </w:p>
     <w:p>
@@ -116,7 +128,13 @@
         <w:rPr>
           <w:rFonts w:eastAsia="Times New Roman"/>
         </w:rPr>
-        <w:t xml:space="preserve">send email to your users.  </w:t>
+        <w:t>send email to your users</w:t>
+      </w:r>
+      <w:r>
+        <w:rPr>
+          <w:rFonts w:eastAsia="Times New Roman"/>
+        </w:rPr>
+        <w:t xml:space="preserve">. </w:t>
       </w:r>
     </w:p>
     <w:p>
@@ -139,33 +157,35 @@
         </w:rPr>
         <w:t xml:space="preserve">You will need access to </w:t>
       </w:r>
-      <w:proofErr w:type="gramStart"/>
-      <w:r>
-        <w:rPr>
-          <w:rFonts w:eastAsia="Times New Roman"/>
-        </w:rPr>
-        <w:t>a SMTP</w:t>
-      </w:r>
-      <w:proofErr w:type="gramEnd"/>
-      <w:r>
-        <w:rPr>
-          <w:rFonts w:eastAsia="Times New Roman"/>
-        </w:rPr>
-        <w:t xml:space="preserve"> server to send </w:t>
-      </w:r>
-      <w:proofErr w:type="gramStart"/>
-      <w:r>
-        <w:rPr>
-          <w:rFonts w:eastAsia="Times New Roman"/>
-        </w:rPr>
-        <w:t>the emails</w:t>
-      </w:r>
-      <w:proofErr w:type="gramEnd"/>
-      <w:r>
-        <w:rPr>
-          <w:rFonts w:eastAsia="Times New Roman"/>
-        </w:rPr>
-        <w:t xml:space="preserve">.  These can be commercial places such as pobox.com, your own email server using Microsoft Server, or a free SMTP server.   </w:t>
+      <w:r>
+        <w:rPr>
+          <w:rFonts w:eastAsia="Times New Roman"/>
+        </w:rPr>
+        <w:t>an SMTP</w:t>
+      </w:r>
+      <w:r>
+        <w:rPr>
+          <w:rFonts w:eastAsia="Times New Roman"/>
+        </w:rPr>
+        <w:t xml:space="preserve"> server to send the emails</w:t>
+      </w:r>
+      <w:r>
+        <w:rPr>
+          <w:rFonts w:eastAsia="Times New Roman"/>
+        </w:rPr>
+        <w:t xml:space="preserve">. </w:t>
+      </w:r>
+      <w:r>
+        <w:rPr>
+          <w:rFonts w:eastAsia="Times New Roman"/>
+        </w:rPr>
+        <w:t>These can be commercial places such as pobox.com, your own email server using Microsoft Server, or a free SMTP server</w:t>
+      </w:r>
+      <w:r>
+        <w:rPr>
+          <w:rFonts w:eastAsia="Times New Roman"/>
+        </w:rPr>
+        <w:t xml:space="preserve">. </w:t>
       </w:r>
       <w:r>
         <w:rPr>
@@ -261,66 +281,95 @@
         <w:rPr>
           <w:rFonts w:eastAsia="Times New Roman"/>
         </w:rPr>
-        <w:t>Emails must be enabled with “Email Enable”</w:t>
-      </w:r>
-      <w:r>
-        <w:rPr>
-          <w:rFonts w:eastAsia="Times New Roman"/>
-        </w:rPr>
-        <w:t>.</w:t>
-      </w:r>
-    </w:p>
-    <w:p>
-      <w:pPr>
-        <w:rPr>
-          <w:rFonts w:eastAsia="Times New Roman"/>
-        </w:rPr>
-      </w:pPr>
-      <w:r>
-        <w:rPr>
-          <w:rFonts w:eastAsia="Times New Roman"/>
-        </w:rPr>
-        <w:t>“</w:t>
-      </w:r>
-      <w:proofErr w:type="gramStart"/>
-      <w:r>
-        <w:rPr>
-          <w:rFonts w:eastAsia="Times New Roman"/>
-        </w:rPr>
-        <w:t>User Name</w:t>
-      </w:r>
-      <w:proofErr w:type="gramEnd"/>
-      <w:r>
-        <w:rPr>
-          <w:rFonts w:eastAsia="Times New Roman"/>
-        </w:rPr>
-        <w:t xml:space="preserve">” and SMTP Password is the email name and password you normally use to log into your email server to send email. Gmail is different: it needs a special “app password”. See GMAIL below. </w:t>
-      </w:r>
-    </w:p>
-    <w:p>
-      <w:pPr>
-        <w:rPr>
-          <w:rFonts w:eastAsia="Times New Roman"/>
-        </w:rPr>
-      </w:pPr>
-      <w:r>
-        <w:rPr>
-          <w:rFonts w:eastAsia="Times New Roman"/>
-        </w:rPr>
-        <w:t>The port should be what your server documentation says.  This is typically 25 for unsecure email, 465 for SSL/TLS Email (choose SslOnConnect), or 587 for TLS (choose StartTls).</w:t>
-      </w:r>
-    </w:p>
-    <w:p>
-      <w:pPr>
-        <w:rPr>
-          <w:rFonts w:eastAsia="Times New Roman"/>
-        </w:rPr>
-      </w:pPr>
-      <w:r>
-        <w:rPr>
-          <w:rFonts w:eastAsia="Times New Roman"/>
-        </w:rPr>
-        <w:t>In my case, I had to use the Automatic setting as none of the others worked</w:t>
+        <w:t>Emails must be enabled with “Email Enable</w:t>
+      </w:r>
+      <w:r>
+        <w:rPr>
+          <w:rFonts w:eastAsia="Times New Roman"/>
+        </w:rPr>
+        <w:t>.”</w:t>
+      </w:r>
+    </w:p>
+    <w:p>
+      <w:pPr>
+        <w:rPr>
+          <w:rFonts w:eastAsia="Times New Roman"/>
+        </w:rPr>
+      </w:pPr>
+      <w:r>
+        <w:rPr>
+          <w:rFonts w:eastAsia="Times New Roman"/>
+        </w:rPr>
+        <w:t>“User Name” and SMTP Password is the email name and password you normally use to log into your email server to send email. Gmail is different: it needs a special “app password</w:t>
+      </w:r>
+      <w:r>
+        <w:rPr>
+          <w:rFonts w:eastAsia="Times New Roman"/>
+        </w:rPr>
+        <w:t>.”</w:t>
+      </w:r>
+      <w:r>
+        <w:rPr>
+          <w:rFonts w:eastAsia="Times New Roman"/>
+        </w:rPr>
+        <w:t xml:space="preserve"> See GMAIL below. </w:t>
+      </w:r>
+    </w:p>
+    <w:p>
+      <w:pPr>
+        <w:rPr>
+          <w:rFonts w:eastAsia="Times New Roman"/>
+        </w:rPr>
+      </w:pPr>
+      <w:r>
+        <w:rPr>
+          <w:rFonts w:eastAsia="Times New Roman"/>
+        </w:rPr>
+        <w:lastRenderedPageBreak/>
+        <w:t>The port should be what your server documentation says</w:t>
+      </w:r>
+      <w:r>
+        <w:rPr>
+          <w:rFonts w:eastAsia="Times New Roman"/>
+        </w:rPr>
+        <w:t xml:space="preserve">. </w:t>
+      </w:r>
+      <w:r>
+        <w:rPr>
+          <w:rFonts w:eastAsia="Times New Roman"/>
+        </w:rPr>
+        <w:t xml:space="preserve">This is typically </w:t>
+      </w:r>
+      <w:r>
+        <w:rPr>
+          <w:rFonts w:eastAsia="Times New Roman"/>
+        </w:rPr>
+        <w:t>twenty-five</w:t>
+      </w:r>
+      <w:r>
+        <w:rPr>
+          <w:rFonts w:eastAsia="Times New Roman"/>
+        </w:rPr>
+        <w:t xml:space="preserve"> for unsecure email, 465 for SSL/TLS Email (choose SslOnConnect), or 587 for TLS (choose StartTls).</w:t>
+      </w:r>
+    </w:p>
+    <w:p>
+      <w:pPr>
+        <w:rPr>
+          <w:rFonts w:eastAsia="Times New Roman"/>
+        </w:rPr>
+      </w:pPr>
+      <w:r>
+        <w:rPr>
+          <w:rFonts w:eastAsia="Times New Roman"/>
+        </w:rPr>
+        <w:t xml:space="preserve">In my case, I had to use the Automatic setting as none of the others </w:t>
+      </w:r>
+      <w:r>
+        <w:rPr>
+          <w:rFonts w:eastAsia="Times New Roman"/>
+        </w:rPr>
+        <w:t>worked.</w:t>
       </w:r>
     </w:p>
     <w:p>
@@ -393,34 +442,32 @@
         <w:rPr>
           <w:rFonts w:eastAsia="Times New Roman"/>
         </w:rPr>
-        <w:t>3. Copy the 16 letters. Google shows them only once.</w:t>
-      </w:r>
-    </w:p>
-    <w:p>
-      <w:pPr>
-        <w:rPr>
-          <w:rFonts w:eastAsia="Times New Roman"/>
-        </w:rPr>
-      </w:pPr>
-      <w:r>
-        <w:rPr>
-          <w:rFonts w:eastAsia="Times New Roman"/>
-        </w:rPr>
-        <w:t xml:space="preserve">4. In </w:t>
-      </w:r>
-      <w:proofErr w:type="spellStart"/>
-      <w:r>
-        <w:rPr>
-          <w:rFonts w:eastAsia="Times New Roman"/>
-        </w:rPr>
-        <w:t>DreamGrid's</w:t>
-      </w:r>
-      <w:proofErr w:type="spellEnd"/>
-      <w:r>
-        <w:rPr>
-          <w:rFonts w:eastAsia="Times New Roman"/>
-        </w:rPr>
-        <w:t xml:space="preserve"> Email panel:</w:t>
+        <w:t xml:space="preserve">3. Copy the </w:t>
+      </w:r>
+      <w:r>
+        <w:rPr>
+          <w:rFonts w:eastAsia="Times New Roman"/>
+        </w:rPr>
+        <w:t>sixteen</w:t>
+      </w:r>
+      <w:r>
+        <w:rPr>
+          <w:rFonts w:eastAsia="Times New Roman"/>
+        </w:rPr>
+        <w:t xml:space="preserve"> letters. Google shows them only once.</w:t>
+      </w:r>
+    </w:p>
+    <w:p>
+      <w:pPr>
+        <w:rPr>
+          <w:rFonts w:eastAsia="Times New Roman"/>
+        </w:rPr>
+      </w:pPr>
+      <w:r>
+        <w:rPr>
+          <w:rFonts w:eastAsia="Times New Roman"/>
+        </w:rPr>
+        <w:t>4. In DreamGrid's Email panel:</w:t>
       </w:r>
     </w:p>
     <w:p>
@@ -446,16 +493,14 @@
         <w:rPr>
           <w:rFonts w:eastAsia="Times New Roman"/>
         </w:rPr>
-        <w:t xml:space="preserve">   - SMTP Password: </w:t>
-      </w:r>
-      <w:proofErr w:type="gramStart"/>
-      <w:r>
-        <w:rPr>
-          <w:rFonts w:eastAsia="Times New Roman"/>
-        </w:rPr>
-        <w:t>the 16</w:t>
-      </w:r>
-      <w:proofErr w:type="gramEnd"/>
+        <w:t xml:space="preserve">   - SMTP Password: the </w:t>
+      </w:r>
+      <w:r>
+        <w:rPr>
+          <w:rFonts w:eastAsia="Times New Roman"/>
+        </w:rPr>
+        <w:t>sixteen</w:t>
+      </w:r>
       <w:r>
         <w:rPr>
           <w:rFonts w:eastAsia="Times New Roman"/>
@@ -499,42 +544,26 @@
         <w:rPr>
           <w:rFonts w:eastAsia="Times New Roman"/>
         </w:rPr>
-        <w:t xml:space="preserve">   - Security: </w:t>
-      </w:r>
-      <w:proofErr w:type="spellStart"/>
-      <w:r>
-        <w:rPr>
-          <w:rFonts w:eastAsia="Times New Roman"/>
-        </w:rPr>
-        <w:t>StartTls</w:t>
-      </w:r>
-      <w:proofErr w:type="spellEnd"/>
-    </w:p>
-    <w:p>
-      <w:pPr>
-        <w:rPr>
-          <w:rFonts w:eastAsia="Times New Roman"/>
-        </w:rPr>
-      </w:pPr>
-      <w:r>
-        <w:rPr>
-          <w:rFonts w:eastAsia="Times New Roman"/>
-        </w:rPr>
-        <w:t>5. Press Test. Restart the regions so that scripts (</w:t>
-      </w:r>
-      <w:proofErr w:type="spellStart"/>
-      <w:r>
-        <w:rPr>
-          <w:rFonts w:eastAsia="Times New Roman"/>
-        </w:rPr>
-        <w:t>llEmail</w:t>
-      </w:r>
-      <w:proofErr w:type="spellEnd"/>
-      <w:r>
-        <w:rPr>
-          <w:rFonts w:eastAsia="Times New Roman"/>
-        </w:rPr>
-        <w:t>) use the new settings.</w:t>
+        <w:t xml:space="preserve">   - Security: StartT</w:t>
+      </w:r>
+      <w:r>
+        <w:rPr>
+          <w:rFonts w:eastAsia="Times New Roman"/>
+        </w:rPr>
+        <w:t>LS</w:t>
+      </w:r>
+    </w:p>
+    <w:p>
+      <w:pPr>
+        <w:rPr>
+          <w:rFonts w:eastAsia="Times New Roman"/>
+        </w:rPr>
+      </w:pPr>
+      <w:r>
+        <w:rPr>
+          <w:rFonts w:eastAsia="Times New Roman"/>
+        </w:rPr>
+        <w:t>5. Press Test. Restart the regions so that scripts (llEmail) use the new settings.</w:t>
       </w:r>
     </w:p>
     <w:p>
@@ -583,28 +612,24 @@
         </w:rPr>
         <w:t xml:space="preserve">- "App passwords" </w:t>
       </w:r>
-      <w:proofErr w:type="gramStart"/>
-      <w:r>
-        <w:rPr>
-          <w:rFonts w:eastAsia="Times New Roman"/>
-        </w:rPr>
-        <w:t>is</w:t>
-      </w:r>
-      <w:proofErr w:type="gramEnd"/>
+      <w:r>
+        <w:rPr>
+          <w:rFonts w:eastAsia="Times New Roman"/>
+        </w:rPr>
+        <w:t>are</w:t>
+      </w:r>
       <w:r>
         <w:rPr>
           <w:rFonts w:eastAsia="Times New Roman"/>
         </w:rPr>
         <w:t xml:space="preserve"> missing </w:t>
       </w:r>
-      <w:proofErr w:type="gramStart"/>
-      <w:r>
-        <w:rPr>
-          <w:rFonts w:eastAsia="Times New Roman"/>
-        </w:rPr>
-        <w:t>on</w:t>
-      </w:r>
-      <w:proofErr w:type="gramEnd"/>
+      <w:r>
+        <w:rPr>
+          <w:rFonts w:eastAsia="Times New Roman"/>
+        </w:rPr>
+        <w:t>from</w:t>
+      </w:r>
       <w:r>
         <w:rPr>
           <w:rFonts w:eastAsia="Times New Roman"/>
@@ -624,19 +649,29 @@
         </w:rPr>
         <w:t xml:space="preserve">- Gmail </w:t>
       </w:r>
-      <w:proofErr w:type="gramStart"/>
-      <w:r>
-        <w:rPr>
-          <w:rFonts w:eastAsia="Times New Roman"/>
-        </w:rPr>
-        <w:t>allows</w:t>
-      </w:r>
-      <w:proofErr w:type="gramEnd"/>
-      <w:r>
-        <w:rPr>
-          <w:rFonts w:eastAsia="Times New Roman"/>
-        </w:rPr>
-        <w:t xml:space="preserve"> about 500 emails a day.</w:t>
+      <w:r>
+        <w:rPr>
+          <w:rFonts w:eastAsia="Times New Roman"/>
+        </w:rPr>
+        <w:t>allows for</w:t>
+      </w:r>
+      <w:r>
+        <w:rPr>
+          <w:rFonts w:eastAsia="Times New Roman"/>
+        </w:rPr>
+        <w:t xml:space="preserve"> about </w:t>
+      </w:r>
+      <w:r>
+        <w:rPr>
+          <w:rFonts w:eastAsia="Times New Roman"/>
+        </w:rPr>
+        <w:t>five hundred</w:t>
+      </w:r>
+      <w:r>
+        <w:rPr>
+          <w:rFonts w:eastAsia="Times New Roman"/>
+        </w:rPr>
+        <w:t xml:space="preserve"> emails a day.</w:t>
       </w:r>
     </w:p>
     <w:p>
@@ -663,7 +698,31 @@
         <w:rPr>
           <w:rFonts w:eastAsia="Times New Roman"/>
         </w:rPr>
-        <w:t>Mail protocols (SMTP, IMAP, and POP3) all have 2 different ways of doing SSL.</w:t>
+        <w:t xml:space="preserve">Mail protocols (SMTP, IMAP, and POP3) all have </w:t>
+      </w:r>
+      <w:r>
+        <w:rPr>
+          <w:rFonts w:eastAsia="Times New Roman"/>
+        </w:rPr>
+        <w:t>two</w:t>
+      </w:r>
+      <w:r>
+        <w:rPr>
+          <w:rFonts w:eastAsia="Times New Roman"/>
+        </w:rPr>
+        <w:t xml:space="preserve"> </w:t>
+      </w:r>
+      <w:r>
+        <w:rPr>
+          <w:rFonts w:eastAsia="Times New Roman"/>
+        </w:rPr>
+        <w:t>separate ways</w:t>
+      </w:r>
+      <w:r>
+        <w:rPr>
+          <w:rFonts w:eastAsia="Times New Roman"/>
+        </w:rPr>
+        <w:t xml:space="preserve"> of doing SSL.</w:t>
       </w:r>
     </w:p>
     <w:p>
@@ -696,7 +755,19 @@
         <w:rPr>
           <w:rFonts w:eastAsia="Times New Roman"/>
         </w:rPr>
-        <w:t xml:space="preserve">and a true SSL mode.  This can do both, or </w:t>
+        <w:t>and a true SSL mode</w:t>
+      </w:r>
+      <w:r>
+        <w:rPr>
+          <w:rFonts w:eastAsia="Times New Roman"/>
+        </w:rPr>
+        <w:t xml:space="preserve">. </w:t>
+      </w:r>
+      <w:r>
+        <w:rPr>
+          <w:rFonts w:eastAsia="Times New Roman"/>
+        </w:rPr>
+        <w:t xml:space="preserve">This can do both, or </w:t>
       </w:r>
       <w:r>
         <w:rPr>
@@ -704,26 +775,12 @@
         </w:rPr>
         <w:t xml:space="preserve">you can use </w:t>
       </w:r>
-      <w:proofErr w:type="gramStart"/>
-      <w:r>
-        <w:rPr>
-          <w:rFonts w:eastAsia="Times New Roman"/>
-        </w:rPr>
-        <w:t>auto</w:t>
-      </w:r>
-      <w:r>
-        <w:rPr>
-          <w:rFonts w:eastAsia="Times New Roman"/>
-        </w:rPr>
-        <w:t>-</w:t>
-      </w:r>
-      <w:r>
-        <w:rPr>
-          <w:rFonts w:eastAsia="Times New Roman"/>
-        </w:rPr>
-        <w:t>detected</w:t>
-      </w:r>
-      <w:proofErr w:type="gramEnd"/>
+      <w:r>
+        <w:rPr>
+          <w:rFonts w:eastAsia="Times New Roman"/>
+        </w:rPr>
+        <w:t>auto detected</w:t>
+      </w:r>
       <w:r>
         <w:rPr>
           <w:rFonts w:eastAsia="Times New Roman"/>
@@ -766,19 +823,31 @@
         <w:rPr>
           <w:rFonts w:ascii="inherit" w:eastAsia="Times New Roman" w:hAnsi="inherit"/>
         </w:rPr>
-        <w:t>: Do</w:t>
+        <w:t xml:space="preserve">: </w:t>
       </w:r>
       <w:r>
         <w:rPr>
           <w:rFonts w:ascii="inherit" w:eastAsia="Times New Roman" w:hAnsi="inherit"/>
         </w:rPr>
+        <w:t>Do</w:t>
+      </w:r>
+      <w:r>
+        <w:rPr>
+          <w:rFonts w:ascii="inherit" w:eastAsia="Times New Roman" w:hAnsi="inherit"/>
+        </w:rPr>
         <w:t>es</w:t>
       </w:r>
       <w:r>
         <w:rPr>
           <w:rFonts w:ascii="inherit" w:eastAsia="Times New Roman" w:hAnsi="inherit"/>
         </w:rPr>
-        <w:t>n't use any form of SSL (or TLS).</w:t>
+        <w:t xml:space="preserve"> not</w:t>
+      </w:r>
+      <w:r>
+        <w:rPr>
+          <w:rFonts w:ascii="inherit" w:eastAsia="Times New Roman" w:hAnsi="inherit"/>
+        </w:rPr>
+        <w:t xml:space="preserve"> use any form of SSL (or TLS).</w:t>
       </w:r>
     </w:p>
     <w:p>
@@ -803,21 +872,31 @@
         <w:rPr>
           <w:rFonts w:ascii="inherit" w:eastAsia="Times New Roman" w:hAnsi="inherit"/>
         </w:rPr>
-        <w:t xml:space="preserve">: Automatically decides which type of SSL mode to use based on the specified port. Note: This only works </w:t>
-      </w:r>
-      <w:proofErr w:type="gramStart"/>
+        <w:t>: Automatically decides which type of SSL mode to use based on the specified port. Note: This only works reliabl</w:t>
+      </w:r>
       <w:r>
         <w:rPr>
           <w:rFonts w:ascii="inherit" w:eastAsia="Times New Roman" w:hAnsi="inherit"/>
         </w:rPr>
-        <w:t>reliable</w:t>
-      </w:r>
-      <w:proofErr w:type="gramEnd"/>
+        <w:t>y</w:t>
+      </w:r>
       <w:r>
         <w:rPr>
           <w:rFonts w:ascii="inherit" w:eastAsia="Times New Roman" w:hAnsi="inherit"/>
         </w:rPr>
-        <w:t xml:space="preserve"> when the port is a standard defined port (e.g. 25, 587 or 465 for SMTP).</w:t>
+        <w:t xml:space="preserve"> when the port is a standard defined port (</w:t>
+      </w:r>
+      <w:r>
+        <w:rPr>
+          <w:rFonts w:ascii="inherit" w:eastAsia="Times New Roman" w:hAnsi="inherit"/>
+        </w:rPr>
+        <w:t>e.g.,</w:t>
+      </w:r>
+      <w:r>
+        <w:rPr>
+          <w:rFonts w:ascii="inherit" w:eastAsia="Times New Roman" w:hAnsi="inherit"/>
+        </w:rPr>
+        <w:t xml:space="preserve"> 25, 587 or 465 for SMTP).</w:t>
       </w:r>
     </w:p>
     <w:p>
@@ -831,7 +910,6 @@
           <w:rFonts w:ascii="inherit" w:eastAsia="Times New Roman" w:hAnsi="inherit"/>
         </w:rPr>
       </w:pPr>
-      <w:proofErr w:type="spellStart"/>
       <w:r>
         <w:rPr>
           <w:rFonts w:ascii="var(--ff-mono)" w:eastAsia="Times New Roman" w:hAnsi="var(--ff-mono)" w:cs="Courier New"/>
@@ -839,7 +917,6 @@
         </w:rPr>
         <w:t>SslOnConnect</w:t>
       </w:r>
-      <w:proofErr w:type="spellEnd"/>
       <w:r>
         <w:rPr>
           <w:rFonts w:ascii="inherit" w:eastAsia="Times New Roman" w:hAnsi="inherit"/>
@@ -870,15 +947,14 @@
           <w:rFonts w:ascii="inherit" w:eastAsia="Times New Roman" w:hAnsi="inherit"/>
         </w:rPr>
       </w:pPr>
-      <w:proofErr w:type="spellStart"/>
       <w:r>
         <w:rPr>
           <w:rFonts w:ascii="var(--ff-mono)" w:eastAsia="Times New Roman" w:hAnsi="var(--ff-mono)" w:cs="Courier New"/>
           <w:bdr w:val="none" w:sz="0" w:space="0" w:color="auto" w:frame="1"/>
         </w:rPr>
+        <w:lastRenderedPageBreak/>
         <w:t>StartTls</w:t>
       </w:r>
-      <w:proofErr w:type="spellEnd"/>
       <w:r>
         <w:rPr>
           <w:rFonts w:ascii="inherit" w:eastAsia="Times New Roman" w:hAnsi="inherit"/>
@@ -896,7 +972,19 @@
         <w:rPr>
           <w:rFonts w:ascii="inherit" w:eastAsia="Times New Roman" w:hAnsi="inherit"/>
         </w:rPr>
-        <w:t> method for SSL/TLS encryption. If the server doesn't support the </w:t>
+        <w:t xml:space="preserve"> method for SSL/TLS encryption. If the server </w:t>
+      </w:r>
+      <w:r>
+        <w:rPr>
+          <w:rFonts w:ascii="inherit" w:eastAsia="Times New Roman" w:hAnsi="inherit"/>
+        </w:rPr>
+        <w:t>does not</w:t>
+      </w:r>
+      <w:r>
+        <w:rPr>
+          <w:rFonts w:ascii="inherit" w:eastAsia="Times New Roman" w:hAnsi="inherit"/>
+        </w:rPr>
+        <w:t xml:space="preserve"> support the </w:t>
       </w:r>
       <w:r>
         <w:rPr>
@@ -992,7 +1080,7 @@
           <w:rFonts w:ascii="var(--ff-mono)" w:eastAsia="Times New Roman" w:hAnsi="var(--ff-mono)" w:cs="Courier New"/>
           <w:bdr w:val="none" w:sz="0" w:space="0" w:color="auto" w:frame="1"/>
         </w:rPr>
-        <w:t>25</w:t>
+        <w:t>twenty-five</w:t>
       </w:r>
       <w:r>
         <w:rPr>
@@ -1000,14 +1088,12 @@
         </w:rPr>
         <w:t xml:space="preserve"> was the original port used for </w:t>
       </w:r>
-      <w:proofErr w:type="gramStart"/>
-      <w:r>
-        <w:rPr>
-          <w:rFonts w:eastAsia="Times New Roman"/>
-        </w:rPr>
-        <w:t>SMTP</w:t>
-      </w:r>
-      <w:proofErr w:type="gramEnd"/>
+      <w:r>
+        <w:rPr>
+          <w:rFonts w:eastAsia="Times New Roman"/>
+        </w:rPr>
+        <w:t>SMTP,</w:t>
+      </w:r>
       <w:r>
         <w:rPr>
           <w:rFonts w:eastAsia="Times New Roman"/>
@@ -1079,7 +1165,6 @@
         </w:rPr>
         <w:t> command extension for IMAP, SMTP and POP3 (well, for POP3, the command is </w:t>
       </w:r>
-      <w:proofErr w:type="gramStart"/>
       <w:r>
         <w:rPr>
           <w:rFonts w:ascii="var(--ff-mono)" w:eastAsia="Times New Roman" w:hAnsi="var(--ff-mono)" w:cs="Courier New"/>
@@ -1087,7 +1172,6 @@
         </w:rPr>
         <w:t>STLS</w:t>
       </w:r>
-      <w:proofErr w:type="gramEnd"/>
       <w:r>
         <w:rPr>
           <w:rFonts w:eastAsia="Times New Roman"/>
@@ -1157,7 +1241,7 @@
           <w:rFonts w:ascii="var(--ff-mono)" w:eastAsia="Times New Roman" w:hAnsi="var(--ff-mono)" w:cs="Courier New"/>
           <w:bdr w:val="none" w:sz="0" w:space="0" w:color="auto" w:frame="1"/>
         </w:rPr>
-        <w:t>25</w:t>
+        <w:t>twenty-five</w:t>
       </w:r>
       <w:r>
         <w:rPr>

</xml_diff>